<commit_message>
additional metadata on docx fiels (version, title, rtd references)
</commit_message>
<xml_diff>
--- a/PREPARE-TIMES-NZ/docs/source/_templates/EECATemplate.docx
+++ b/PREPARE-TIMES-NZ/docs/source/_templates/EECATemplate.docx
@@ -2,9 +2,756 @@
 <file path=word/document.xml><?xml version="1.0" encoding="utf-8"?>
 <w:document xmlns:wpc="http://schemas.microsoft.com/office/word/2010/wordprocessingCanvas" xmlns:cx="http://schemas.microsoft.com/office/drawing/2014/chartex" xmlns:cx1="http://schemas.microsoft.com/office/drawing/2015/9/8/chartex" xmlns:cx2="http://schemas.microsoft.com/office/drawing/2015/10/21/chartex" xmlns:cx3="http://schemas.microsoft.com/office/drawing/2016/5/9/chartex" xmlns:cx4="http://schemas.microsoft.com/office/drawing/2016/5/10/chartex" xmlns:cx5="http://schemas.microsoft.com/office/drawing/2016/5/11/chartex" xmlns:cx6="http://schemas.microsoft.com/office/drawing/2016/5/12/chartex" xmlns:cx7="http://schemas.microsoft.com/office/drawing/2016/5/13/chartex" xmlns:cx8="http://schemas.microsoft.com/office/drawing/2016/5/14/chartex" xmlns:mc="http://schemas.openxmlformats.org/markup-compatibility/2006" xmlns:aink="http://schemas.microsoft.com/office/drawing/2016/ink" xmlns:am3d="http://schemas.microsoft.com/office/drawing/2017/model3d" xmlns:o="urn:schemas-microsoft-com:office:office" xmlns:oel="http://schemas.microsoft.com/office/2019/extlst" xmlns:r="http://schemas.openxmlformats.org/officeDocument/2006/relationships" xmlns:m="http://schemas.openxmlformats.org/officeDocument/2006/math" xmlns:v="urn:schemas-microsoft-com:vml" xmlns:wp14="http://schemas.microsoft.com/office/word/2010/wordprocessingDrawing" xmlns:wp="http://schemas.openxmlformats.org/drawingml/2006/wordprocessingDrawing" xmlns:w10="urn:schemas-microsoft-com:office:word" xmlns:w="http://schemas.openxmlformats.org/wordprocessingml/2006/main" xmlns:w14="http://schemas.microsoft.com/office/word/2010/wordml" xmlns:w15="http://schemas.microsoft.com/office/word/2012/wordml" xmlns:w16cex="http://schemas.microsoft.com/office/word/2018/wordml/cex" xmlns:w16cid="http://schemas.microsoft.com/office/word/2016/wordml/cid" xmlns:w16="http://schemas.microsoft.com/office/word/2018/wordml" xmlns:w16du="http://schemas.microsoft.com/office/word/2023/wordml/word16du" xmlns:w16sdtdh="http://schemas.microsoft.com/office/word/2020/wordml/sdtdatahash" xmlns:w16sdtfl="http://schemas.microsoft.com/office/word/2024/wordml/sdtformatlock" xmlns:w16se="http://schemas.microsoft.com/office/word/2015/wordml/symex" xmlns:wpg="http://schemas.microsoft.com/office/word/2010/wordprocessingGroup" xmlns:wpi="http://schemas.microsoft.com/office/word/2010/wordprocessingInk" xmlns:wne="http://schemas.microsoft.com/office/word/2006/wordml" xmlns:wps="http://schemas.microsoft.com/office/word/2010/wordprocessingShape" mc:Ignorable="w14 w15 w16se w16cid w16 w16cex w16sdtdh w16sdtfl w16du wp14">
   <w:body>
+    <w:sdt>
+      <w:sdtPr>
+        <w:id w:val="467949910"/>
+        <w:docPartObj>
+          <w:docPartGallery w:val="Cover Pages"/>
+          <w:docPartUnique/>
+        </w:docPartObj>
+      </w:sdtPr>
+      <w:sdtEndPr>
+        <w:rPr>
+          <w:bCs/>
+        </w:rPr>
+      </w:sdtEndPr>
+      <w:sdtContent>
+        <w:p/>
+        <w:p>
+          <w:pPr>
+            <w:spacing w:after="160" w:line="259" w:lineRule="auto"/>
+          </w:pPr>
+          <w:r>
+            <w:rPr>
+              <w:noProof/>
+            </w:rPr>
+            <mc:AlternateContent>
+              <mc:Choice Requires="wps">
+                <w:drawing>
+                  <wp:anchor distT="0" distB="0" distL="182880" distR="182880" simplePos="0" relativeHeight="251660288" behindDoc="0" locked="0" layoutInCell="1" allowOverlap="1" wp14:anchorId="4453D158" wp14:editId="5BE917FB">
+                    <wp:simplePos x="0" y="0"/>
+                    <wp:positionH relativeFrom="margin">
+                      <wp:posOffset>318770</wp:posOffset>
+                    </wp:positionH>
+                    <wp:positionV relativeFrom="page">
+                      <wp:posOffset>4133850</wp:posOffset>
+                    </wp:positionV>
+                    <wp:extent cx="4686300" cy="6720840"/>
+                    <wp:effectExtent l="0" t="0" r="12700" b="1905"/>
+                    <wp:wrapSquare wrapText="bothSides"/>
+                    <wp:docPr id="131" name="Text Box 32"/>
+                    <wp:cNvGraphicFramePr/>
+                    <a:graphic xmlns:a="http://schemas.openxmlformats.org/drawingml/2006/main">
+                      <a:graphicData uri="http://schemas.microsoft.com/office/word/2010/wordprocessingShape">
+                        <wps:wsp>
+                          <wps:cNvSpPr txBox="1"/>
+                          <wps:spPr>
+                            <a:xfrm>
+                              <a:off x="0" y="0"/>
+                              <a:ext cx="4686300" cy="6720840"/>
+                            </a:xfrm>
+                            <a:prstGeom prst="rect">
+                              <a:avLst/>
+                            </a:prstGeom>
+                            <a:noFill/>
+                            <a:ln w="6350">
+                              <a:noFill/>
+                            </a:ln>
+                            <a:effectLst/>
+                          </wps:spPr>
+                          <wps:style>
+                            <a:lnRef idx="0">
+                              <a:schemeClr val="accent1"/>
+                            </a:lnRef>
+                            <a:fillRef idx="0">
+                              <a:schemeClr val="accent1"/>
+                            </a:fillRef>
+                            <a:effectRef idx="0">
+                              <a:schemeClr val="accent1"/>
+                            </a:effectRef>
+                            <a:fontRef idx="minor">
+                              <a:schemeClr val="dk1"/>
+                            </a:fontRef>
+                          </wps:style>
+                          <wps:txbx>
+                            <w:txbxContent>
+                              <w:p>
+                                <w:pPr>
+                                  <w:pStyle w:val="Title"/>
+                                </w:pPr>
+                                <w:sdt>
+                                  <w:sdtPr>
+                                    <w:rPr>
+                                      <w:sz w:val="56"/>
+                                      <w:szCs w:val="40"/>
+                                    </w:rPr>
+                                    <w:alias w:val="Title"/>
+                                    <w:tag w:val=""/>
+                                    <w:id w:val="151731938"/>
+                                    <w:dataBinding w:prefixMappings="xmlns:ns0='http://purl.org/dc/elements/1.1/' xmlns:ns1='http://schemas.openxmlformats.org/package/2006/metadata/core-properties' " w:xpath="/ns1:coreProperties[1]/ns0:title[1]" w:storeItemID="{6C3C8BC8-F283-45AE-878A-BAB7291924A1}"/>
+                                    <w:text/>
+                                  </w:sdtPr>
+                                  <w:sdtContent>
+                                    <w:r>
+                                      <w:rPr>
+                                        <w:sz w:val="56"/>
+                                        <w:szCs w:val="40"/>
+                                      </w:rPr>
+                                      <w:t>Blank Template</w:t>
+                                    </w:r>
+                                  </w:sdtContent>
+                                </w:sdt>
+                              </w:p>
+                              <w:p>
+                                <w:pPr>
+                                  <w:pStyle w:val="NoSpacing"/>
+                                  <w:spacing w:before="40" w:after="40"/>
+                                  <w:rPr>
+                                    <w:caps/>
+                                    <w:color w:val="061D30" w:themeColor="accent5" w:themeShade="80"/>
+                                    <w:sz w:val="40"/>
+                                    <w:szCs w:val="40"/>
+                                  </w:rPr>
+                                </w:pPr>
+                              </w:p>
+                              <w:p>
+                                <w:pPr>
+                                  <w:pStyle w:val="NoSpacing"/>
+                                  <w:spacing w:before="40" w:after="40"/>
+                                  <w:rPr>
+                                    <w:rStyle w:val="Heading1Char"/>
+                                  </w:rPr>
+                                </w:pPr>
+                                <w:sdt>
+                                  <w:sdtPr>
+                                    <w:alias w:val="Subject"/>
+                                    <w:tag w:val=""/>
+                                    <w:id w:val="78569321"/>
+                                    <w:placeholder>
+                                      <w:docPart w:val="3B7EAF4C9B6743AEA93787B16B679F82"/>
+                                    </w:placeholder>
+                                    <w:showingPlcHdr/>
+                                    <w:dataBinding w:prefixMappings="xmlns:ns0='http://purl.org/dc/elements/1.1/' xmlns:ns1='http://schemas.openxmlformats.org/package/2006/metadata/core-properties' " w:xpath="/ns1:coreProperties[1]/ns0:subject[1]" w:storeItemID="{6C3C8BC8-F283-45AE-878A-BAB7291924A1}"/>
+                                    <w:text/>
+                                  </w:sdtPr>
+                                  <w:sdtEndPr>
+                                    <w:rPr>
+                                      <w:rStyle w:val="Heading1Char"/>
+                                      <w:rFonts w:ascii="Franklin Gothic Medium Cond" w:hAnsi="Franklin Gothic Medium Cond"/>
+                                      <w:bCs/>
+                                      <w:color w:val="0C3B62"/>
+                                      <w:sz w:val="30"/>
+                                      <w:szCs w:val="28"/>
+                                      <w14:numForm w14:val="lining"/>
+                                    </w:rPr>
+                                  </w:sdtEndPr>
+                                  <w:sdtContent>
+                                    <w:r>
+                                      <w:rPr>
+                                        <w:rStyle w:val="Heading1Char"/>
+                                      </w:rPr>
+                                      <w:t>[Subject]</w:t>
+                                    </w:r>
+                                  </w:sdtContent>
+                                </w:sdt>
+                              </w:p>
+                              <w:p>
+                                <w:pPr>
+                                  <w:pStyle w:val="Heading1"/>
+                                  <w:rPr>
+                                    <w:caps/>
+                                    <w:color w:val="061D30" w:themeColor="accent5" w:themeShade="80"/>
+                                    <w:sz w:val="28"/>
+                                  </w:rPr>
+                                </w:pPr>
+                                <w:r>
+                                  <w:fldChar w:fldCharType="begin"/>
+                                </w:r>
+                                <w:r>
+                                  <w:instrText xml:space="preserve"> DATE  \@ "d MMMM yyyy"  \* MERGEFORMAT </w:instrText>
+                                </w:r>
+                                <w:r>
+                                  <w:fldChar w:fldCharType="separate"/>
+                                </w:r>
+                                <w:r>
+                                  <w:rPr>
+                                    <w:noProof/>
+                                  </w:rPr>
+                                  <w:t>1</w:t>
+                                </w:r>
+                                <w:r>
+                                  <w:rPr>
+                                    <w:noProof/>
+                                  </w:rPr>
+                                  <w:t>2</w:t>
+                                </w:r>
+                                <w:r>
+                                  <w:rPr>
+                                    <w:noProof/>
+                                  </w:rPr>
+                                  <w:t xml:space="preserve"> December 2025</w:t>
+                                </w:r>
+                                <w:r>
+                                  <w:fldChar w:fldCharType="end"/>
+                                </w:r>
+                              </w:p>
+                              <w:p>
+                                <w:pPr>
+                                  <w:pStyle w:val="NoSpacing"/>
+                                  <w:spacing w:before="40" w:after="40"/>
+                                  <w:rPr>
+                                    <w:caps/>
+                                    <w:color w:val="061D30" w:themeColor="accent5" w:themeShade="80"/>
+                                    <w:sz w:val="28"/>
+                                    <w:szCs w:val="28"/>
+                                  </w:rPr>
+                                </w:pPr>
+                              </w:p>
+                              <w:p>
+                                <w:pPr>
+                                  <w:pStyle w:val="NoSpacing"/>
+                                  <w:spacing w:before="40" w:after="40"/>
+                                  <w:rPr>
+                                    <w:caps/>
+                                    <w:color w:val="061D30" w:themeColor="accent5" w:themeShade="80"/>
+                                    <w:sz w:val="28"/>
+                                    <w:szCs w:val="28"/>
+                                  </w:rPr>
+                                </w:pPr>
+                              </w:p>
+                              <w:p>
+                                <w:pPr>
+                                  <w:pStyle w:val="NoSpacing"/>
+                                  <w:spacing w:before="40" w:after="40"/>
+                                  <w:rPr>
+                                    <w:caps/>
+                                    <w:color w:val="061D30" w:themeColor="accent5" w:themeShade="80"/>
+                                    <w:sz w:val="28"/>
+                                    <w:szCs w:val="28"/>
+                                  </w:rPr>
+                                </w:pPr>
+                              </w:p>
+                              <w:p>
+                                <w:pPr>
+                                  <w:pStyle w:val="NoSpacing"/>
+                                  <w:spacing w:before="40" w:after="40"/>
+                                  <w:rPr>
+                                    <w:caps/>
+                                    <w:color w:val="061D30" w:themeColor="accent5" w:themeShade="80"/>
+                                    <w:sz w:val="28"/>
+                                    <w:szCs w:val="28"/>
+                                  </w:rPr>
+                                </w:pPr>
+                              </w:p>
+                              <w:p>
+                                <w:pPr>
+                                  <w:pStyle w:val="NoSpacing"/>
+                                  <w:spacing w:before="40" w:after="40"/>
+                                  <w:rPr>
+                                    <w:caps/>
+                                    <w:color w:val="061D30" w:themeColor="accent5" w:themeShade="80"/>
+                                    <w:sz w:val="28"/>
+                                    <w:szCs w:val="28"/>
+                                  </w:rPr>
+                                </w:pPr>
+                              </w:p>
+                              <w:p>
+                                <w:pPr>
+                                  <w:pStyle w:val="NoSpacing"/>
+                                  <w:spacing w:before="40" w:after="40"/>
+                                  <w:rPr>
+                                    <w:caps/>
+                                    <w:color w:val="061D30" w:themeColor="accent5" w:themeShade="80"/>
+                                    <w:sz w:val="28"/>
+                                    <w:szCs w:val="28"/>
+                                  </w:rPr>
+                                </w:pPr>
+                              </w:p>
+                              <w:p>
+                                <w:pPr>
+                                  <w:pStyle w:val="NoSpacing"/>
+                                  <w:spacing w:before="40" w:after="40"/>
+                                  <w:rPr>
+                                    <w:caps/>
+                                    <w:color w:val="061D30" w:themeColor="accent5" w:themeShade="80"/>
+                                    <w:sz w:val="28"/>
+                                    <w:szCs w:val="28"/>
+                                  </w:rPr>
+                                </w:pPr>
+                              </w:p>
+                              <w:p>
+                                <w:pPr>
+                                  <w:pStyle w:val="NoSpacing"/>
+                                  <w:spacing w:before="40" w:after="40"/>
+                                  <w:rPr>
+                                    <w:caps/>
+                                    <w:color w:val="061D30" w:themeColor="accent5" w:themeShade="80"/>
+                                    <w:sz w:val="28"/>
+                                    <w:szCs w:val="28"/>
+                                  </w:rPr>
+                                </w:pPr>
+                              </w:p>
+                              <w:p>
+                                <w:pPr>
+                                  <w:pStyle w:val="NoSpacing"/>
+                                  <w:spacing w:before="40" w:after="40"/>
+                                  <w:rPr>
+                                    <w:caps/>
+                                    <w:color w:val="061D30" w:themeColor="accent5" w:themeShade="80"/>
+                                    <w:sz w:val="28"/>
+                                    <w:szCs w:val="28"/>
+                                  </w:rPr>
+                                </w:pPr>
+                              </w:p>
+                              <w:p>
+                                <w:r>
+                                  <w:t>See s</w:t>
+                                </w:r>
+                                <w:r>
+                                  <w:t>ource documentation at:</w:t>
+                                </w:r>
+                              </w:p>
+                              <w:p>
+                                <w:hyperlink r:id="rId11" w:history="1">
+                                  <w:r>
+                                    <w:rPr>
+                                      <w:rStyle w:val="Hyperlink"/>
+                                    </w:rPr>
+                                    <w:t>https://prepare-times-nz-dev.readthedocs.io/en/latest/index.html</w:t>
+                                  </w:r>
+                                </w:hyperlink>
+                              </w:p>
+                              <w:p>
+                                <w:pPr>
+                                  <w:pStyle w:val="NoSpacing"/>
+                                  <w:spacing w:before="40" w:after="40"/>
+                                  <w:rPr>
+                                    <w:caps/>
+                                    <w:color w:val="061D30" w:themeColor="accent5" w:themeShade="80"/>
+                                    <w:sz w:val="28"/>
+                                    <w:szCs w:val="28"/>
+                                  </w:rPr>
+                                </w:pPr>
+                              </w:p>
+                              <w:p>
+                                <w:pPr>
+                                  <w:pStyle w:val="NoSpacing"/>
+                                  <w:spacing w:before="40" w:after="40"/>
+                                  <w:rPr>
+                                    <w:caps/>
+                                    <w:color w:val="061D30" w:themeColor="accent5" w:themeShade="80"/>
+                                    <w:sz w:val="28"/>
+                                    <w:szCs w:val="28"/>
+                                  </w:rPr>
+                                </w:pPr>
+                              </w:p>
+                              <w:sdt>
+                                <w:sdtPr>
+                                  <w:rPr>
+                                    <w:caps/>
+                                    <w:color w:val="0C3B61" w:themeColor="accent5"/>
+                                    <w:sz w:val="24"/>
+                                    <w:szCs w:val="24"/>
+                                  </w:rPr>
+                                  <w:alias w:val="Author"/>
+                                  <w:tag w:val=""/>
+                                  <w:id w:val="-1536112409"/>
+                                  <w:showingPlcHdr/>
+                                  <w:dataBinding w:prefixMappings="xmlns:ns0='http://purl.org/dc/elements/1.1/' xmlns:ns1='http://schemas.openxmlformats.org/package/2006/metadata/core-properties' " w:xpath="/ns1:coreProperties[1]/ns0:creator[1]" w:storeItemID="{6C3C8BC8-F283-45AE-878A-BAB7291924A1}"/>
+                                  <w:text/>
+                                </w:sdtPr>
+                                <w:sdtContent>
+                                  <w:p>
+                                    <w:pPr>
+                                      <w:pStyle w:val="NoSpacing"/>
+                                      <w:spacing w:before="80" w:after="40"/>
+                                      <w:rPr>
+                                        <w:caps/>
+                                        <w:color w:val="0C3B61" w:themeColor="accent5"/>
+                                        <w:sz w:val="24"/>
+                                        <w:szCs w:val="24"/>
+                                      </w:rPr>
+                                    </w:pPr>
+                                    <w:r>
+                                      <w:rPr>
+                                        <w:caps/>
+                                        <w:color w:val="0C3B61" w:themeColor="accent5"/>
+                                        <w:sz w:val="24"/>
+                                        <w:szCs w:val="24"/>
+                                      </w:rPr>
+                                      <w:t xml:space="preserve">     </w:t>
+                                    </w:r>
+                                  </w:p>
+                                </w:sdtContent>
+                              </w:sdt>
+                            </w:txbxContent>
+                          </wps:txbx>
+                          <wps:bodyPr rot="0" spcFirstLastPara="0" vertOverflow="overflow" horzOverflow="overflow" vert="horz" wrap="square" lIns="0" tIns="0" rIns="0" bIns="0" numCol="1" spcCol="0" rtlCol="0" fromWordArt="0" anchor="t" anchorCtr="0" forceAA="0" compatLnSpc="1">
+                            <a:prstTxWarp prst="textNoShape">
+                              <a:avLst/>
+                            </a:prstTxWarp>
+                            <a:spAutoFit/>
+                          </wps:bodyPr>
+                        </wps:wsp>
+                      </a:graphicData>
+                    </a:graphic>
+                    <wp14:sizeRelH relativeFrom="margin">
+                      <wp14:pctWidth>79000</wp14:pctWidth>
+                    </wp14:sizeRelH>
+                    <wp14:sizeRelV relativeFrom="page">
+                      <wp14:pctHeight>35000</wp14:pctHeight>
+                    </wp14:sizeRelV>
+                  </wp:anchor>
+                </w:drawing>
+              </mc:Choice>
+              <mc:Fallback>
+                <w:pict>
+                  <v:shapetype w14:anchorId="4453D158" id="_x0000_t202" coordsize="21600,21600" o:spt="202" path="m,l,21600r21600,l21600,xe">
+                    <v:stroke joinstyle="miter"/>
+                    <v:path gradientshapeok="t" o:connecttype="rect"/>
+                  </v:shapetype>
+                  <v:shape id="Text Box 32" o:spid="_x0000_s1026" type="#_x0000_t202" style="position:absolute;margin-left:25.1pt;margin-top:325.5pt;width:369pt;height:529.2pt;z-index:251660288;visibility:visible;mso-wrap-style:square;mso-width-percent:790;mso-height-percent:350;mso-wrap-distance-left:14.4pt;mso-wrap-distance-top:0;mso-wrap-distance-right:14.4pt;mso-wrap-distance-bottom:0;mso-position-horizontal:absolute;mso-position-horizontal-relative:margin;mso-position-vertical:absolute;mso-position-vertical-relative:page;mso-width-percent:790;mso-height-percent:350;mso-width-relative:margin;mso-height-relative:page;v-text-anchor:top" o:gfxdata="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" filled="f" stroked="f" strokeweight=".5pt">
+                    <v:textbox style="mso-fit-shape-to-text:t" inset="0,0,0,0">
+                      <w:txbxContent>
+                        <w:p>
+                          <w:pPr>
+                            <w:pStyle w:val="Title"/>
+                          </w:pPr>
+                          <w:sdt>
+                            <w:sdtPr>
+                              <w:rPr>
+                                <w:sz w:val="56"/>
+                                <w:szCs w:val="40"/>
+                              </w:rPr>
+                              <w:alias w:val="Title"/>
+                              <w:tag w:val=""/>
+                              <w:id w:val="151731938"/>
+                              <w:dataBinding w:prefixMappings="xmlns:ns0='http://purl.org/dc/elements/1.1/' xmlns:ns1='http://schemas.openxmlformats.org/package/2006/metadata/core-properties' " w:xpath="/ns1:coreProperties[1]/ns0:title[1]" w:storeItemID="{6C3C8BC8-F283-45AE-878A-BAB7291924A1}"/>
+                              <w:text/>
+                            </w:sdtPr>
+                            <w:sdtContent>
+                              <w:r>
+                                <w:rPr>
+                                  <w:sz w:val="56"/>
+                                  <w:szCs w:val="40"/>
+                                </w:rPr>
+                                <w:t>Blank Template</w:t>
+                              </w:r>
+                            </w:sdtContent>
+                          </w:sdt>
+                        </w:p>
+                        <w:p>
+                          <w:pPr>
+                            <w:pStyle w:val="NoSpacing"/>
+                            <w:spacing w:before="40" w:after="40"/>
+                            <w:rPr>
+                              <w:caps/>
+                              <w:color w:val="061D30" w:themeColor="accent5" w:themeShade="80"/>
+                              <w:sz w:val="40"/>
+                              <w:szCs w:val="40"/>
+                            </w:rPr>
+                          </w:pPr>
+                        </w:p>
+                        <w:p>
+                          <w:pPr>
+                            <w:pStyle w:val="NoSpacing"/>
+                            <w:spacing w:before="40" w:after="40"/>
+                            <w:rPr>
+                              <w:rStyle w:val="Heading1Char"/>
+                            </w:rPr>
+                          </w:pPr>
+                          <w:sdt>
+                            <w:sdtPr>
+                              <w:alias w:val="Subject"/>
+                              <w:tag w:val=""/>
+                              <w:id w:val="78569321"/>
+                              <w:placeholder>
+                                <w:docPart w:val="3B7EAF4C9B6743AEA93787B16B679F82"/>
+                              </w:placeholder>
+                              <w:showingPlcHdr/>
+                              <w:dataBinding w:prefixMappings="xmlns:ns0='http://purl.org/dc/elements/1.1/' xmlns:ns1='http://schemas.openxmlformats.org/package/2006/metadata/core-properties' " w:xpath="/ns1:coreProperties[1]/ns0:subject[1]" w:storeItemID="{6C3C8BC8-F283-45AE-878A-BAB7291924A1}"/>
+                              <w:text/>
+                            </w:sdtPr>
+                            <w:sdtEndPr>
+                              <w:rPr>
+                                <w:rStyle w:val="Heading1Char"/>
+                                <w:rFonts w:ascii="Franklin Gothic Medium Cond" w:hAnsi="Franklin Gothic Medium Cond"/>
+                                <w:bCs/>
+                                <w:color w:val="0C3B62"/>
+                                <w:sz w:val="30"/>
+                                <w:szCs w:val="28"/>
+                                <w14:numForm w14:val="lining"/>
+                              </w:rPr>
+                            </w:sdtEndPr>
+                            <w:sdtContent>
+                              <w:r>
+                                <w:rPr>
+                                  <w:rStyle w:val="Heading1Char"/>
+                                </w:rPr>
+                                <w:t>[Subject]</w:t>
+                              </w:r>
+                            </w:sdtContent>
+                          </w:sdt>
+                        </w:p>
+                        <w:p>
+                          <w:pPr>
+                            <w:pStyle w:val="Heading1"/>
+                            <w:rPr>
+                              <w:caps/>
+                              <w:color w:val="061D30" w:themeColor="accent5" w:themeShade="80"/>
+                              <w:sz w:val="28"/>
+                            </w:rPr>
+                          </w:pPr>
+                          <w:r>
+                            <w:fldChar w:fldCharType="begin"/>
+                          </w:r>
+                          <w:r>
+                            <w:instrText xml:space="preserve"> DATE  \@ "d MMMM yyyy"  \* MERGEFORMAT </w:instrText>
+                          </w:r>
+                          <w:r>
+                            <w:fldChar w:fldCharType="separate"/>
+                          </w:r>
+                          <w:r>
+                            <w:rPr>
+                              <w:noProof/>
+                            </w:rPr>
+                            <w:t>1</w:t>
+                          </w:r>
+                          <w:r>
+                            <w:rPr>
+                              <w:noProof/>
+                            </w:rPr>
+                            <w:t>2</w:t>
+                          </w:r>
+                          <w:r>
+                            <w:rPr>
+                              <w:noProof/>
+                            </w:rPr>
+                            <w:t xml:space="preserve"> December 2025</w:t>
+                          </w:r>
+                          <w:r>
+                            <w:fldChar w:fldCharType="end"/>
+                          </w:r>
+                        </w:p>
+                        <w:p>
+                          <w:pPr>
+                            <w:pStyle w:val="NoSpacing"/>
+                            <w:spacing w:before="40" w:after="40"/>
+                            <w:rPr>
+                              <w:caps/>
+                              <w:color w:val="061D30" w:themeColor="accent5" w:themeShade="80"/>
+                              <w:sz w:val="28"/>
+                              <w:szCs w:val="28"/>
+                            </w:rPr>
+                          </w:pPr>
+                        </w:p>
+                        <w:p>
+                          <w:pPr>
+                            <w:pStyle w:val="NoSpacing"/>
+                            <w:spacing w:before="40" w:after="40"/>
+                            <w:rPr>
+                              <w:caps/>
+                              <w:color w:val="061D30" w:themeColor="accent5" w:themeShade="80"/>
+                              <w:sz w:val="28"/>
+                              <w:szCs w:val="28"/>
+                            </w:rPr>
+                          </w:pPr>
+                        </w:p>
+                        <w:p>
+                          <w:pPr>
+                            <w:pStyle w:val="NoSpacing"/>
+                            <w:spacing w:before="40" w:after="40"/>
+                            <w:rPr>
+                              <w:caps/>
+                              <w:color w:val="061D30" w:themeColor="accent5" w:themeShade="80"/>
+                              <w:sz w:val="28"/>
+                              <w:szCs w:val="28"/>
+                            </w:rPr>
+                          </w:pPr>
+                        </w:p>
+                        <w:p>
+                          <w:pPr>
+                            <w:pStyle w:val="NoSpacing"/>
+                            <w:spacing w:before="40" w:after="40"/>
+                            <w:rPr>
+                              <w:caps/>
+                              <w:color w:val="061D30" w:themeColor="accent5" w:themeShade="80"/>
+                              <w:sz w:val="28"/>
+                              <w:szCs w:val="28"/>
+                            </w:rPr>
+                          </w:pPr>
+                        </w:p>
+                        <w:p>
+                          <w:pPr>
+                            <w:pStyle w:val="NoSpacing"/>
+                            <w:spacing w:before="40" w:after="40"/>
+                            <w:rPr>
+                              <w:caps/>
+                              <w:color w:val="061D30" w:themeColor="accent5" w:themeShade="80"/>
+                              <w:sz w:val="28"/>
+                              <w:szCs w:val="28"/>
+                            </w:rPr>
+                          </w:pPr>
+                        </w:p>
+                        <w:p>
+                          <w:pPr>
+                            <w:pStyle w:val="NoSpacing"/>
+                            <w:spacing w:before="40" w:after="40"/>
+                            <w:rPr>
+                              <w:caps/>
+                              <w:color w:val="061D30" w:themeColor="accent5" w:themeShade="80"/>
+                              <w:sz w:val="28"/>
+                              <w:szCs w:val="28"/>
+                            </w:rPr>
+                          </w:pPr>
+                        </w:p>
+                        <w:p>
+                          <w:pPr>
+                            <w:pStyle w:val="NoSpacing"/>
+                            <w:spacing w:before="40" w:after="40"/>
+                            <w:rPr>
+                              <w:caps/>
+                              <w:color w:val="061D30" w:themeColor="accent5" w:themeShade="80"/>
+                              <w:sz w:val="28"/>
+                              <w:szCs w:val="28"/>
+                            </w:rPr>
+                          </w:pPr>
+                        </w:p>
+                        <w:p>
+                          <w:pPr>
+                            <w:pStyle w:val="NoSpacing"/>
+                            <w:spacing w:before="40" w:after="40"/>
+                            <w:rPr>
+                              <w:caps/>
+                              <w:color w:val="061D30" w:themeColor="accent5" w:themeShade="80"/>
+                              <w:sz w:val="28"/>
+                              <w:szCs w:val="28"/>
+                            </w:rPr>
+                          </w:pPr>
+                        </w:p>
+                        <w:p>
+                          <w:pPr>
+                            <w:pStyle w:val="NoSpacing"/>
+                            <w:spacing w:before="40" w:after="40"/>
+                            <w:rPr>
+                              <w:caps/>
+                              <w:color w:val="061D30" w:themeColor="accent5" w:themeShade="80"/>
+                              <w:sz w:val="28"/>
+                              <w:szCs w:val="28"/>
+                            </w:rPr>
+                          </w:pPr>
+                        </w:p>
+                        <w:p>
+                          <w:r>
+                            <w:t>See s</w:t>
+                          </w:r>
+                          <w:r>
+                            <w:t>ource documentation at:</w:t>
+                          </w:r>
+                        </w:p>
+                        <w:p>
+                          <w:hyperlink r:id="rId12" w:history="1">
+                            <w:r>
+                              <w:rPr>
+                                <w:rStyle w:val="Hyperlink"/>
+                              </w:rPr>
+                              <w:t>https://prepare-times-nz-dev.readthedocs.io/en/latest/index.html</w:t>
+                            </w:r>
+                          </w:hyperlink>
+                        </w:p>
+                        <w:p>
+                          <w:pPr>
+                            <w:pStyle w:val="NoSpacing"/>
+                            <w:spacing w:before="40" w:after="40"/>
+                            <w:rPr>
+                              <w:caps/>
+                              <w:color w:val="061D30" w:themeColor="accent5" w:themeShade="80"/>
+                              <w:sz w:val="28"/>
+                              <w:szCs w:val="28"/>
+                            </w:rPr>
+                          </w:pPr>
+                        </w:p>
+                        <w:p>
+                          <w:pPr>
+                            <w:pStyle w:val="NoSpacing"/>
+                            <w:spacing w:before="40" w:after="40"/>
+                            <w:rPr>
+                              <w:caps/>
+                              <w:color w:val="061D30" w:themeColor="accent5" w:themeShade="80"/>
+                              <w:sz w:val="28"/>
+                              <w:szCs w:val="28"/>
+                            </w:rPr>
+                          </w:pPr>
+                        </w:p>
+                        <w:sdt>
+                          <w:sdtPr>
+                            <w:rPr>
+                              <w:caps/>
+                              <w:color w:val="0C3B61" w:themeColor="accent5"/>
+                              <w:sz w:val="24"/>
+                              <w:szCs w:val="24"/>
+                            </w:rPr>
+                            <w:alias w:val="Author"/>
+                            <w:tag w:val=""/>
+                            <w:id w:val="-1536112409"/>
+                            <w:showingPlcHdr/>
+                            <w:dataBinding w:prefixMappings="xmlns:ns0='http://purl.org/dc/elements/1.1/' xmlns:ns1='http://schemas.openxmlformats.org/package/2006/metadata/core-properties' " w:xpath="/ns1:coreProperties[1]/ns0:creator[1]" w:storeItemID="{6C3C8BC8-F283-45AE-878A-BAB7291924A1}"/>
+                            <w:text/>
+                          </w:sdtPr>
+                          <w:sdtContent>
+                            <w:p>
+                              <w:pPr>
+                                <w:pStyle w:val="NoSpacing"/>
+                                <w:spacing w:before="80" w:after="40"/>
+                                <w:rPr>
+                                  <w:caps/>
+                                  <w:color w:val="0C3B61" w:themeColor="accent5"/>
+                                  <w:sz w:val="24"/>
+                                  <w:szCs w:val="24"/>
+                                </w:rPr>
+                              </w:pPr>
+                              <w:r>
+                                <w:rPr>
+                                  <w:caps/>
+                                  <w:color w:val="0C3B61" w:themeColor="accent5"/>
+                                  <w:sz w:val="24"/>
+                                  <w:szCs w:val="24"/>
+                                </w:rPr>
+                                <w:t xml:space="preserve">     </w:t>
+                              </w:r>
+                            </w:p>
+                          </w:sdtContent>
+                        </w:sdt>
+                      </w:txbxContent>
+                    </v:textbox>
+                    <w10:wrap type="square" anchorx="margin" anchory="page"/>
+                  </v:shape>
+                </w:pict>
+              </mc:Fallback>
+            </mc:AlternateContent>
+          </w:r>
+          <w:r>
+            <w:rPr>
+              <w:bCs/>
+            </w:rPr>
+            <w:br w:type="page"/>
+          </w:r>
+        </w:p>
+      </w:sdtContent>
+    </w:sdt>
     <w:p>
       <w:pPr>
-        <w:pStyle w:val="TOCHeading"/>
+        <w:pStyle w:val="Title"/>
+      </w:pPr>
+      <w:fldSimple w:instr=" TITLE  \* Caps  \* MERGEFORMAT ">
+        <w:r>
+          <w:t>Blank Template</w:t>
+        </w:r>
+      </w:fldSimple>
+    </w:p>
+    <w:p>
+      <w:pPr>
+        <w:pStyle w:val="Heading1"/>
       </w:pPr>
       <w:r>
         <w:t>Section Header (</w:t>
@@ -18,7 +765,7 @@
     </w:p>
     <w:p>
       <w:pPr>
-        <w:pStyle w:val="TOCHeading"/>
+        <w:pStyle w:val="Heading2"/>
       </w:pPr>
       <w:r>
         <w:t>Sub Header (</w:t>
@@ -641,7 +1388,7 @@
           <w:rStyle w:val="Hyperlink"/>
         </w:rPr>
       </w:pPr>
-      <w:hyperlink r:id="rId11" w:history="1">
+      <w:hyperlink r:id="rId13" w:history="1">
         <w:r>
           <w:rPr>
             <w:rFonts w:eastAsia="Sitka Display" w:cs="Times New Roman"/>
@@ -653,11 +1400,12 @@
       </w:hyperlink>
     </w:p>
     <w:sectPr>
-      <w:footerReference w:type="default" r:id="rId12"/>
-      <w:headerReference w:type="first" r:id="rId13"/>
-      <w:footerReference w:type="first" r:id="rId14"/>
+      <w:footerReference w:type="default" r:id="rId14"/>
+      <w:headerReference w:type="first" r:id="rId15"/>
+      <w:footerReference w:type="first" r:id="rId16"/>
       <w:pgSz w:w="11906" w:h="16838"/>
       <w:pgMar w:top="2268" w:right="1134" w:bottom="2041" w:left="1418" w:header="850" w:footer="720" w:gutter="0"/>
+      <w:pgNumType w:start="0"/>
       <w:cols w:space="708"/>
       <w:titlePg/>
       <w:docGrid w:linePitch="360"/>
@@ -692,69 +1440,6 @@
 </file>
 
 <file path=word/footer1.xml><?xml version="1.0" encoding="utf-8"?>
-<w:ftr xmlns:wpc="http://schemas.microsoft.com/office/word/2010/wordprocessingCanvas" xmlns:cx="http://schemas.microsoft.com/office/drawing/2014/chartex" xmlns:cx1="http://schemas.microsoft.com/office/drawing/2015/9/8/chartex" xmlns:cx2="http://schemas.microsoft.com/office/drawing/2015/10/21/chartex" xmlns:cx3="http://schemas.microsoft.com/office/drawing/2016/5/9/chartex" xmlns:cx4="http://schemas.microsoft.com/office/drawing/2016/5/10/chartex" xmlns:cx5="http://schemas.microsoft.com/office/drawing/2016/5/11/chartex" xmlns:cx6="http://schemas.microsoft.com/office/drawing/2016/5/12/chartex" xmlns:cx7="http://schemas.microsoft.com/office/drawing/2016/5/13/chartex" xmlns:cx8="http://schemas.microsoft.com/office/drawing/2016/5/14/chartex" xmlns:mc="http://schemas.openxmlformats.org/markup-compatibility/2006" xmlns:aink="http://schemas.microsoft.com/office/drawing/2016/ink" xmlns:am3d="http://schemas.microsoft.com/office/drawing/2017/model3d" xmlns:o="urn:schemas-microsoft-com:office:office" xmlns:oel="http://schemas.microsoft.com/office/2019/extlst" xmlns:r="http://schemas.openxmlformats.org/officeDocument/2006/relationships" xmlns:m="http://schemas.openxmlformats.org/officeDocument/2006/math" xmlns:v="urn:schemas-microsoft-com:vml" xmlns:wp14="http://schemas.microsoft.com/office/word/2010/wordprocessingDrawing" xmlns:wp="http://schemas.openxmlformats.org/drawingml/2006/wordprocessingDrawing" xmlns:w10="urn:schemas-microsoft-com:office:word" xmlns:w="http://schemas.openxmlformats.org/wordprocessingml/2006/main" xmlns:w14="http://schemas.microsoft.com/office/word/2010/wordml" xmlns:w15="http://schemas.microsoft.com/office/word/2012/wordml" xmlns:w16cex="http://schemas.microsoft.com/office/word/2018/wordml/cex" xmlns:w16cid="http://schemas.microsoft.com/office/word/2016/wordml/cid" xmlns:w16="http://schemas.microsoft.com/office/word/2018/wordml" xmlns:w16du="http://schemas.microsoft.com/office/word/2023/wordml/word16du" xmlns:w16sdtdh="http://schemas.microsoft.com/office/word/2020/wordml/sdtdatahash" xmlns:w16sdtfl="http://schemas.microsoft.com/office/word/2024/wordml/sdtformatlock" xmlns:w16se="http://schemas.microsoft.com/office/word/2015/wordml/symex" xmlns:wpg="http://schemas.microsoft.com/office/word/2010/wordprocessingGroup" xmlns:wpi="http://schemas.microsoft.com/office/word/2010/wordprocessingInk" xmlns:wne="http://schemas.microsoft.com/office/word/2006/wordml" xmlns:wps="http://schemas.microsoft.com/office/word/2010/wordprocessingShape" mc:Ignorable="w14 w15 w16se w16cid w16 w16cex w16sdtdh w16sdtfl w16du wp14">
-  <w:p>
-    <w:pPr>
-      <w:pStyle w:val="Footer"/>
-    </w:pPr>
-    <w:fldSimple w:instr=" TITLE   \* MERGEFORMAT ">
-      <w:r>
-        <w:t>Blank Template</w:t>
-      </w:r>
-    </w:fldSimple>
-    <w:r>
-      <w:t xml:space="preserve"> </w:t>
-    </w:r>
-    <w:r>
-      <w:t>|</w:t>
-    </w:r>
-    <w:r>
-      <w:t xml:space="preserve"> </w:t>
-    </w:r>
-    <w:r>
-      <w:fldChar w:fldCharType="begin"/>
-    </w:r>
-    <w:r>
-      <w:instrText xml:space="preserve"> DATE  \@ "d MMMM yyyy"  \* MERGEFORMAT </w:instrText>
-    </w:r>
-    <w:r>
-      <w:fldChar w:fldCharType="separate"/>
-    </w:r>
-    <w:r>
-      <w:rPr>
-        <w:noProof/>
-      </w:rPr>
-      <w:t>16 December 2025</w:t>
-    </w:r>
-    <w:r>
-      <w:fldChar w:fldCharType="end"/>
-    </w:r>
-    <w:r>
-      <w:ptab w:relativeTo="margin" w:alignment="right" w:leader="none"/>
-    </w:r>
-    <w:r>
-      <w:fldChar w:fldCharType="begin"/>
-    </w:r>
-    <w:r>
-      <w:instrText xml:space="preserve"> PAGE   \* MERGEFORMAT </w:instrText>
-    </w:r>
-    <w:r>
-      <w:fldChar w:fldCharType="separate"/>
-    </w:r>
-    <w:r>
-      <w:t>1</w:t>
-    </w:r>
-    <w:r>
-      <w:rPr>
-        <w:noProof/>
-      </w:rPr>
-      <w:fldChar w:fldCharType="end"/>
-    </w:r>
-  </w:p>
-</w:ftr>
-</file>
-
-<file path=word/footer2.xml><?xml version="1.0" encoding="utf-8"?>
 <w:ftr xmlns:wpc="http://schemas.microsoft.com/office/word/2010/wordprocessingCanvas" xmlns:cx="http://schemas.microsoft.com/office/drawing/2014/chartex" xmlns:cx1="http://schemas.microsoft.com/office/drawing/2015/9/8/chartex" xmlns:cx2="http://schemas.microsoft.com/office/drawing/2015/10/21/chartex" xmlns:cx3="http://schemas.microsoft.com/office/drawing/2016/5/9/chartex" xmlns:cx4="http://schemas.microsoft.com/office/drawing/2016/5/10/chartex" xmlns:cx5="http://schemas.microsoft.com/office/drawing/2016/5/11/chartex" xmlns:cx6="http://schemas.microsoft.com/office/drawing/2016/5/12/chartex" xmlns:cx7="http://schemas.microsoft.com/office/drawing/2016/5/13/chartex" xmlns:cx8="http://schemas.microsoft.com/office/drawing/2016/5/14/chartex" xmlns:mc="http://schemas.openxmlformats.org/markup-compatibility/2006" xmlns:aink="http://schemas.microsoft.com/office/drawing/2016/ink" xmlns:am3d="http://schemas.microsoft.com/office/drawing/2017/model3d" xmlns:o="urn:schemas-microsoft-com:office:office" xmlns:oel="http://schemas.microsoft.com/office/2019/extlst" xmlns:r="http://schemas.openxmlformats.org/officeDocument/2006/relationships" xmlns:m="http://schemas.openxmlformats.org/officeDocument/2006/math" xmlns:v="urn:schemas-microsoft-com:vml" xmlns:wp14="http://schemas.microsoft.com/office/word/2010/wordprocessingDrawing" xmlns:wp="http://schemas.openxmlformats.org/drawingml/2006/wordprocessingDrawing" xmlns:w10="urn:schemas-microsoft-com:office:word" xmlns:w="http://schemas.openxmlformats.org/wordprocessingml/2006/main" xmlns:w14="http://schemas.microsoft.com/office/word/2010/wordml" xmlns:w15="http://schemas.microsoft.com/office/word/2012/wordml" xmlns:w16cex="http://schemas.microsoft.com/office/word/2018/wordml/cex" xmlns:w16cid="http://schemas.microsoft.com/office/word/2016/wordml/cid" xmlns:w16="http://schemas.microsoft.com/office/word/2018/wordml" xmlns:w16du="http://schemas.microsoft.com/office/word/2023/wordml/word16du" xmlns:w16sdtdh="http://schemas.microsoft.com/office/word/2020/wordml/sdtdatahash" xmlns:w16sdtfl="http://schemas.microsoft.com/office/word/2024/wordml/sdtformatlock" xmlns:w16se="http://schemas.microsoft.com/office/word/2015/wordml/symex" xmlns:wpg="http://schemas.microsoft.com/office/word/2010/wordprocessingGroup" xmlns:wpi="http://schemas.microsoft.com/office/word/2010/wordprocessingInk" xmlns:wne="http://schemas.microsoft.com/office/word/2006/wordml" xmlns:wps="http://schemas.microsoft.com/office/word/2010/wordprocessingShape" mc:Ignorable="w14 w15 w16se w16cid w16 w16cex w16sdtdh w16sdtfl w16du wp14">
   <w:p>
     <w:pPr>
@@ -784,11 +1469,35 @@
     <w:r>
       <w:t xml:space="preserve"> </w:t>
     </w:r>
+    <w:sdt>
+      <w:sdtPr>
+        <w:alias w:val="Subject"/>
+        <w:tag w:val=""/>
+        <w:id w:val="1608781721"/>
+        <w:placeholder>
+          <w:docPart w:val="0CBD2169431A43DB97F79531F97C5B93"/>
+        </w:placeholder>
+        <w:showingPlcHdr/>
+        <w:dataBinding w:prefixMappings="xmlns:ns0='http://purl.org/dc/elements/1.1/' xmlns:ns1='http://schemas.openxmlformats.org/package/2006/metadata/core-properties' " w:xpath="/ns1:coreProperties[1]/ns0:subject[1]" w:storeItemID="{6C3C8BC8-F283-45AE-878A-BAB7291924A1}"/>
+        <w:text/>
+      </w:sdtPr>
+      <w:sdtContent>
+        <w:r>
+          <w:rPr>
+            <w:rStyle w:val="PlaceholderText"/>
+          </w:rPr>
+          <w:t>[Subject]</w:t>
+        </w:r>
+      </w:sdtContent>
+    </w:sdt>
+    <w:r>
+      <w:t xml:space="preserve"> | </w:t>
+    </w:r>
     <w:r>
       <w:fldChar w:fldCharType="begin"/>
     </w:r>
     <w:r>
-      <w:instrText xml:space="preserve"> DATE  \@ "d MMMM yyyy"  \* MERGEFORMAT </w:instrText>
+      <w:instrText xml:space="preserve"> CREATEDATE  \@ "d/MM/yyyy"  \* MERGEFORMAT </w:instrText>
     </w:r>
     <w:r>
       <w:fldChar w:fldCharType="separate"/>
@@ -797,10 +1506,101 @@
       <w:rPr>
         <w:noProof/>
       </w:rPr>
-      <w:t>16 December 2025</w:t>
+      <w:t>16/12/2025</w:t>
     </w:r>
     <w:r>
       <w:fldChar w:fldCharType="end"/>
+    </w:r>
+    <w:r>
+      <w:t xml:space="preserve"> | Source: </w:t>
+    </w:r>
+    <w:hyperlink r:id="rId1" w:history="1">
+      <w:r>
+        <w:rPr>
+          <w:rStyle w:val="Hyperlink"/>
+        </w:rPr>
+        <w:t>readthedocs.io</w:t>
+      </w:r>
+    </w:hyperlink>
+  </w:p>
+</w:ftr>
+</file>
+
+<file path=word/footer2.xml><?xml version="1.0" encoding="utf-8"?>
+<w:ftr xmlns:wpc="http://schemas.microsoft.com/office/word/2010/wordprocessingCanvas" xmlns:cx="http://schemas.microsoft.com/office/drawing/2014/chartex" xmlns:cx1="http://schemas.microsoft.com/office/drawing/2015/9/8/chartex" xmlns:cx2="http://schemas.microsoft.com/office/drawing/2015/10/21/chartex" xmlns:cx3="http://schemas.microsoft.com/office/drawing/2016/5/9/chartex" xmlns:cx4="http://schemas.microsoft.com/office/drawing/2016/5/10/chartex" xmlns:cx5="http://schemas.microsoft.com/office/drawing/2016/5/11/chartex" xmlns:cx6="http://schemas.microsoft.com/office/drawing/2016/5/12/chartex" xmlns:cx7="http://schemas.microsoft.com/office/drawing/2016/5/13/chartex" xmlns:cx8="http://schemas.microsoft.com/office/drawing/2016/5/14/chartex" xmlns:mc="http://schemas.openxmlformats.org/markup-compatibility/2006" xmlns:aink="http://schemas.microsoft.com/office/drawing/2016/ink" xmlns:am3d="http://schemas.microsoft.com/office/drawing/2017/model3d" xmlns:o="urn:schemas-microsoft-com:office:office" xmlns:oel="http://schemas.microsoft.com/office/2019/extlst" xmlns:r="http://schemas.openxmlformats.org/officeDocument/2006/relationships" xmlns:m="http://schemas.openxmlformats.org/officeDocument/2006/math" xmlns:v="urn:schemas-microsoft-com:vml" xmlns:wp14="http://schemas.microsoft.com/office/word/2010/wordprocessingDrawing" xmlns:wp="http://schemas.openxmlformats.org/drawingml/2006/wordprocessingDrawing" xmlns:w10="urn:schemas-microsoft-com:office:word" xmlns:w="http://schemas.openxmlformats.org/wordprocessingml/2006/main" xmlns:w14="http://schemas.microsoft.com/office/word/2010/wordml" xmlns:w15="http://schemas.microsoft.com/office/word/2012/wordml" xmlns:w16cex="http://schemas.microsoft.com/office/word/2018/wordml/cex" xmlns:w16cid="http://schemas.microsoft.com/office/word/2016/wordml/cid" xmlns:w16="http://schemas.microsoft.com/office/word/2018/wordml" xmlns:w16du="http://schemas.microsoft.com/office/word/2023/wordml/word16du" xmlns:w16sdtdh="http://schemas.microsoft.com/office/word/2020/wordml/sdtdatahash" xmlns:w16sdtfl="http://schemas.microsoft.com/office/word/2024/wordml/sdtformatlock" xmlns:w16se="http://schemas.microsoft.com/office/word/2015/wordml/symex" xmlns:wpg="http://schemas.microsoft.com/office/word/2010/wordprocessingGroup" xmlns:wpi="http://schemas.microsoft.com/office/word/2010/wordprocessingInk" xmlns:wne="http://schemas.microsoft.com/office/word/2006/wordml" xmlns:wps="http://schemas.microsoft.com/office/word/2010/wordprocessingShape" mc:Ignorable="w14 w15 w16se w16cid w16 w16cex w16sdtdh w16sdtfl w16du wp14">
+  <w:p>
+    <w:pPr>
+      <w:pStyle w:val="Footer"/>
+    </w:pPr>
+    <w:fldSimple w:instr=" TITLE   \* MERGEFORMAT ">
+      <w:r>
+        <w:t>Blank Template</w:t>
+      </w:r>
+    </w:fldSimple>
+    <w:r>
+      <w:t xml:space="preserve"> </w:t>
+    </w:r>
+    <w:r>
+      <w:t>|</w:t>
+    </w:r>
+    <w:r>
+      <w:t xml:space="preserve"> </w:t>
+    </w:r>
+    <w:sdt>
+      <w:sdtPr>
+        <w:alias w:val="Subject"/>
+        <w:tag w:val=""/>
+        <w:id w:val="-1172633307"/>
+        <w:placeholder>
+          <w:docPart w:val="EED0D978832147E183E1F47B8B979F37"/>
+        </w:placeholder>
+        <w:showingPlcHdr/>
+        <w:dataBinding w:prefixMappings="xmlns:ns0='http://purl.org/dc/elements/1.1/' xmlns:ns1='http://schemas.openxmlformats.org/package/2006/metadata/core-properties' " w:xpath="/ns1:coreProperties[1]/ns0:subject[1]" w:storeItemID="{6C3C8BC8-F283-45AE-878A-BAB7291924A1}"/>
+        <w:text/>
+      </w:sdtPr>
+      <w:sdtContent>
+        <w:r>
+          <w:rPr>
+            <w:rStyle w:val="PlaceholderText"/>
+          </w:rPr>
+          <w:t>[Subject]</w:t>
+        </w:r>
+      </w:sdtContent>
+    </w:sdt>
+    <w:r>
+      <w:t xml:space="preserve"> | </w:t>
+    </w:r>
+    <w:r>
+      <w:fldChar w:fldCharType="begin"/>
+    </w:r>
+    <w:r>
+      <w:instrText xml:space="preserve"> CREATEDATE  \@ "d/MM/yyyy"  \* MERGEFORMAT </w:instrText>
+    </w:r>
+    <w:r>
+      <w:fldChar w:fldCharType="separate"/>
+    </w:r>
+    <w:r>
+      <w:rPr>
+        <w:noProof/>
+      </w:rPr>
+      <w:t>16/12/2025</w:t>
+    </w:r>
+    <w:r>
+      <w:fldChar w:fldCharType="end"/>
+    </w:r>
+    <w:r>
+      <w:t xml:space="preserve"> | Source: </w:t>
+    </w:r>
+    <w:hyperlink r:id="rId1" w:history="1">
+      <w:r>
+        <w:rPr>
+          <w:rStyle w:val="Hyperlink"/>
+        </w:rPr>
+        <w:t>readthedocs.io</w:t>
+      </w:r>
+    </w:hyperlink>
+    <w:r>
+      <w:t xml:space="preserve"> </w:t>
     </w:r>
     <w:r>
       <w:ptab w:relativeTo="margin" w:alignment="right" w:leader="none"/>
@@ -946,7 +1746,7 @@
               <wp:lineTo x="0" y="0"/>
             </wp:wrapPolygon>
           </wp:wrapThrough>
-          <wp:docPr id="713585734" name="Picture 713585734" descr="A logo of a company&#10;&#10;AI-generated content may be incorrect."/>
+          <wp:docPr id="618849411" name="Picture 618849411" descr="A logo of a company&#10;&#10;AI-generated content may be incorrect."/>
           <wp:cNvGraphicFramePr>
             <a:graphicFrameLocks xmlns:a="http://schemas.openxmlformats.org/drawingml/2006/main" noChangeAspect="1"/>
           </wp:cNvGraphicFramePr>
@@ -1012,7 +1812,7 @@
           <wp:extent cx="2290006" cy="383305"/>
           <wp:effectExtent l="0" t="0" r="0" b="0"/>
           <wp:wrapNone/>
-          <wp:docPr id="9" name="Picture 9"/>
+          <wp:docPr id="1775814331" name="Picture 1775814331"/>
           <wp:cNvGraphicFramePr>
             <a:graphicFrameLocks xmlns:a="http://schemas.openxmlformats.org/drawingml/2006/main" noChangeAspect="1"/>
           </wp:cNvGraphicFramePr>
@@ -1127,7 +1927,13 @@
       </mc:AlternateContent>
     </w:r>
     <w:r>
-      <w:t>TIMES-NZ</w:t>
+      <w:fldChar w:fldCharType="begin"/>
+    </w:r>
+    <w:r>
+      <w:instrText xml:space="preserve"> SUBJECT  \* Upper  \* MERGEFORMAT </w:instrText>
+    </w:r>
+    <w:r>
+      <w:fldChar w:fldCharType="end"/>
     </w:r>
   </w:p>
 </w:hdr>
@@ -1861,7 +2667,7 @@
     <w:lsdException w:name="List Number 3" w:semiHidden="1"/>
     <w:lsdException w:name="List Number 4" w:semiHidden="1" w:unhideWhenUsed="1"/>
     <w:lsdException w:name="List Number 5" w:semiHidden="1" w:unhideWhenUsed="1"/>
-    <w:lsdException w:name="Title" w:semiHidden="1" w:uiPriority="10" w:qFormat="1"/>
+    <w:lsdException w:name="Title" w:semiHidden="1" w:uiPriority="10"/>
     <w:lsdException w:name="Closing" w:semiHidden="1" w:unhideWhenUsed="1"/>
     <w:lsdException w:name="Signature" w:semiHidden="1" w:unhideWhenUsed="1"/>
     <w:lsdException w:name="Default Paragraph Font" w:semiHidden="1" w:uiPriority="1" w:unhideWhenUsed="1"/>
@@ -2251,7 +3057,6 @@
   <w:style w:type="character" w:default="1" w:styleId="DefaultParagraphFont">
     <w:name w:val="Default Paragraph Font"/>
     <w:uiPriority w:val="1"/>
-    <w:semiHidden/>
     <w:unhideWhenUsed/>
   </w:style>
   <w:style w:type="table" w:default="1" w:styleId="TableNormal">
@@ -2834,6 +3639,63 @@
     <w:rPr>
       <w:color w:val="478DFF" w:themeColor="followedHyperlink"/>
       <w:u w:val="single"/>
+    </w:rPr>
+  </w:style>
+  <w:style w:type="paragraph" w:styleId="NoSpacing">
+    <w:name w:val="No Spacing"/>
+    <w:link w:val="NoSpacingChar"/>
+    <w:uiPriority w:val="1"/>
+    <w:qFormat/>
+    <w:rsid w:val="001F42E8"/>
+    <w:pPr>
+      <w:spacing w:after="0" w:line="240" w:lineRule="auto"/>
+    </w:pPr>
+    <w:rPr>
+      <w:rFonts w:eastAsiaTheme="minorEastAsia"/>
+      <w:lang w:val="en-US"/>
+    </w:rPr>
+  </w:style>
+  <w:style w:type="character" w:customStyle="1" w:styleId="NoSpacingChar">
+    <w:name w:val="No Spacing Char"/>
+    <w:basedOn w:val="DefaultParagraphFont"/>
+    <w:link w:val="NoSpacing"/>
+    <w:uiPriority w:val="1"/>
+    <w:rsid w:val="001F42E8"/>
+    <w:rPr>
+      <w:rFonts w:eastAsiaTheme="minorEastAsia"/>
+      <w:lang w:val="en-US"/>
+    </w:rPr>
+  </w:style>
+  <w:style w:type="paragraph" w:styleId="Title">
+    <w:name w:val="Title"/>
+    <w:basedOn w:val="Heading1"/>
+    <w:next w:val="Normal"/>
+    <w:link w:val="TitleChar"/>
+    <w:autoRedefine/>
+    <w:uiPriority w:val="10"/>
+    <w:semiHidden/>
+    <w:rsid w:val="00D319B2"/>
+    <w:pPr>
+      <w:spacing w:line="240" w:lineRule="auto"/>
+    </w:pPr>
+    <w:rPr>
+      <w:sz w:val="44"/>
+    </w:rPr>
+  </w:style>
+  <w:style w:type="character" w:customStyle="1" w:styleId="TitleChar">
+    <w:name w:val="Title Char"/>
+    <w:basedOn w:val="DefaultParagraphFont"/>
+    <w:link w:val="Title"/>
+    <w:uiPriority w:val="10"/>
+    <w:semiHidden/>
+    <w:rsid w:val="00D319B2"/>
+    <w:rPr>
+      <w:rFonts w:ascii="Franklin Gothic Medium Cond" w:hAnsi="Franklin Gothic Medium Cond"/>
+      <w:bCs/>
+      <w:color w:val="0C3B62"/>
+      <w:sz w:val="44"/>
+      <w:szCs w:val="28"/>
+      <w14:numForm w14:val="lining"/>
     </w:rPr>
   </w:style>
 </w:styles>
@@ -2916,6 +3778,90 @@
           </w:pPr>
           <w:r>
             <w:t>Type chapter title (level 3)</w:t>
+          </w:r>
+        </w:p>
+      </w:docPartBody>
+    </w:docPart>
+    <w:docPart>
+      <w:docPartPr>
+        <w:name w:val="EED0D978832147E183E1F47B8B979F37"/>
+        <w:category>
+          <w:name w:val="General"/>
+          <w:gallery w:val="placeholder"/>
+        </w:category>
+        <w:types>
+          <w:type w:val="bbPlcHdr"/>
+        </w:types>
+        <w:behaviors>
+          <w:behavior w:val="content"/>
+        </w:behaviors>
+        <w:guid w:val="{C870C43F-24D5-40F3-A715-7BB8AB0123B7}"/>
+      </w:docPartPr>
+      <w:docPartBody>
+        <w:p>
+          <w:r>
+            <w:rPr>
+              <w:rStyle w:val="PlaceholderText"/>
+            </w:rPr>
+            <w:t>[Subject]</w:t>
+          </w:r>
+        </w:p>
+      </w:docPartBody>
+    </w:docPart>
+    <w:docPart>
+      <w:docPartPr>
+        <w:name w:val="0CBD2169431A43DB97F79531F97C5B93"/>
+        <w:category>
+          <w:name w:val="General"/>
+          <w:gallery w:val="placeholder"/>
+        </w:category>
+        <w:types>
+          <w:type w:val="bbPlcHdr"/>
+        </w:types>
+        <w:behaviors>
+          <w:behavior w:val="content"/>
+        </w:behaviors>
+        <w:guid w:val="{25352466-E8F9-4B65-8E83-FCA78330E866}"/>
+      </w:docPartPr>
+      <w:docPartBody>
+        <w:p>
+          <w:pPr>
+            <w:pStyle w:val="0CBD2169431A43DB97F79531F97C5B93"/>
+          </w:pPr>
+          <w:r>
+            <w:rPr>
+              <w:rStyle w:val="PlaceholderText"/>
+            </w:rPr>
+            <w:t>[Subject]</w:t>
+          </w:r>
+        </w:p>
+      </w:docPartBody>
+    </w:docPart>
+    <w:docPart>
+      <w:docPartPr>
+        <w:name w:val="3B7EAF4C9B6743AEA93787B16B679F82"/>
+        <w:category>
+          <w:name w:val="General"/>
+          <w:gallery w:val="placeholder"/>
+        </w:category>
+        <w:types>
+          <w:type w:val="bbPlcHdr"/>
+        </w:types>
+        <w:behaviors>
+          <w:behavior w:val="content"/>
+        </w:behaviors>
+        <w:guid w:val="{4F436F3C-19CB-4FA6-B3E6-3BD6EBA68B70}"/>
+      </w:docPartPr>
+      <w:docPartBody>
+        <w:p>
+          <w:pPr>
+            <w:pStyle w:val="3B7EAF4C9B6743AEA93787B16B679F82"/>
+          </w:pPr>
+          <w:r>
+            <w:rPr>
+              <w:rStyle w:val="PlaceholderText"/>
+            </w:rPr>
+            <w:t>[Subject]</w:t>
           </w:r>
         </w:p>
       </w:docPartBody>
@@ -3015,8 +3961,11 @@
   <w:rsids>
     <w:rsidRoot w:val="00F7486B"/>
     <w:rsid w:val="00A50B54"/>
+    <w:rsid w:val="00AF6AAE"/>
     <w:rsid w:val="00B3215F"/>
+    <w:rsid w:val="00B52FF3"/>
     <w:rsid w:val="00F7486B"/>
+    <w:rsid w:val="00FD5AF4"/>
   </w:rsids>
   <m:mathPr>
     <m:mathFont m:val="Cambria Math"/>
@@ -3479,6 +4428,44 @@
     <w:name w:val="B7667F427C554229AAD3F30B02909EEF"/>
     <w:rsid w:val="00F7486B"/>
   </w:style>
+  <w:style w:type="paragraph" w:customStyle="1" w:styleId="C314D2331F884350A32942DF05427CE6">
+    <w:name w:val="C314D2331F884350A32942DF05427CE6"/>
+    <w:rsid w:val="00B52FF3"/>
+  </w:style>
+  <w:style w:type="paragraph" w:customStyle="1" w:styleId="CB9507D6024A4FEA89CEE3AC2147D68E">
+    <w:name w:val="CB9507D6024A4FEA89CEE3AC2147D68E"/>
+    <w:rsid w:val="00B52FF3"/>
+  </w:style>
+  <w:style w:type="paragraph" w:customStyle="1" w:styleId="1E89A0771B9D457EB39A689FC92F6931">
+    <w:name w:val="1E89A0771B9D457EB39A689FC92F6931"/>
+    <w:rsid w:val="00B52FF3"/>
+  </w:style>
+  <w:style w:type="paragraph" w:customStyle="1" w:styleId="4F50CCD0D05749A988EEB547A70C61EF">
+    <w:name w:val="4F50CCD0D05749A988EEB547A70C61EF"/>
+    <w:rsid w:val="00B52FF3"/>
+  </w:style>
+  <w:style w:type="paragraph" w:customStyle="1" w:styleId="2FB676CE89CD425582D66503F9182759">
+    <w:name w:val="2FB676CE89CD425582D66503F9182759"/>
+    <w:rsid w:val="00B52FF3"/>
+  </w:style>
+  <w:style w:type="character" w:styleId="PlaceholderText">
+    <w:name w:val="Placeholder Text"/>
+    <w:basedOn w:val="DefaultParagraphFont"/>
+    <w:uiPriority w:val="99"/>
+    <w:semiHidden/>
+    <w:rsid w:val="00B52FF3"/>
+    <w:rPr>
+      <w:color w:val="808080"/>
+    </w:rPr>
+  </w:style>
+  <w:style w:type="paragraph" w:customStyle="1" w:styleId="0CBD2169431A43DB97F79531F97C5B93">
+    <w:name w:val="0CBD2169431A43DB97F79531F97C5B93"/>
+    <w:rsid w:val="00B52FF3"/>
+  </w:style>
+  <w:style w:type="paragraph" w:customStyle="1" w:styleId="3B7EAF4C9B6743AEA93787B16B679F82">
+    <w:name w:val="3B7EAF4C9B6743AEA93787B16B679F82"/>
+    <w:rsid w:val="00B52FF3"/>
+  </w:style>
 </w:styles>
 </file>
 
@@ -3691,12 +4678,7 @@
 </file>
 
 <file path=customXml/item1.xml><?xml version="1.0" encoding="utf-8"?>
-<?mso-contentType ?>
-<FormTemplates xmlns="http://schemas.microsoft.com/sharepoint/v3/contenttype/forms">
-  <Display>DocumentLibraryForm</Display>
-  <Edit>DocumentLibraryForm</Edit>
-  <New>DocumentLibraryForm</New>
-</FormTemplates>
+<b:Sources xmlns:b="http://schemas.openxmlformats.org/officeDocument/2006/bibliography" xmlns="http://schemas.openxmlformats.org/officeDocument/2006/bibliography" SelectedStyle="/APASixthEditionOfficeOnline.xsl" StyleName="APA" Version="6"/>
 </file>
 
 <file path=customXml/item2.xml><?xml version="1.0" encoding="utf-8"?>
@@ -3844,7 +4826,12 @@
 </file>
 
 <file path=customXml/item3.xml><?xml version="1.0" encoding="utf-8"?>
-<b:Sources xmlns:b="http://schemas.openxmlformats.org/officeDocument/2006/bibliography" xmlns="http://schemas.openxmlformats.org/officeDocument/2006/bibliography" SelectedStyle="/APASixthEditionOfficeOnline.xsl" StyleName="APA" Version="6"/>
+<?mso-contentType ?>
+<FormTemplates xmlns="http://schemas.microsoft.com/sharepoint/v3/contenttype/forms">
+  <Display>DocumentLibraryForm</Display>
+  <Edit>DocumentLibraryForm</Edit>
+  <New>DocumentLibraryForm</New>
+</FormTemplates>
 </file>
 
 <file path=customXml/item4.xml><?xml version="1.0" encoding="utf-8"?>
@@ -3854,9 +4841,9 @@
 </file>
 
 <file path=customXml/itemProps1.xml><?xml version="1.0" encoding="utf-8"?>
-<ds:datastoreItem xmlns:ds="http://schemas.openxmlformats.org/officeDocument/2006/customXml" ds:itemID="{09EA917C-A118-4A8B-B76C-4FA89C10D8E1}">
+<ds:datastoreItem xmlns:ds="http://schemas.openxmlformats.org/officeDocument/2006/customXml" ds:itemID="{D227166E-CFE3-3D44-8D71-41F8EC1A194E}">
   <ds:schemaRefs>
-    <ds:schemaRef ds:uri="http://schemas.microsoft.com/sharepoint/v3/contenttype/forms"/>
+    <ds:schemaRef ds:uri="http://schemas.openxmlformats.org/officeDocument/2006/bibliography"/>
   </ds:schemaRefs>
 </ds:datastoreItem>
 </file>
@@ -3880,9 +4867,9 @@
 </file>
 
 <file path=customXml/itemProps3.xml><?xml version="1.0" encoding="utf-8"?>
-<ds:datastoreItem xmlns:ds="http://schemas.openxmlformats.org/officeDocument/2006/customXml" ds:itemID="{D227166E-CFE3-3D44-8D71-41F8EC1A194E}">
+<ds:datastoreItem xmlns:ds="http://schemas.openxmlformats.org/officeDocument/2006/customXml" ds:itemID="{09EA917C-A118-4A8B-B76C-4FA89C10D8E1}">
   <ds:schemaRefs>
-    <ds:schemaRef ds:uri="http://schemas.openxmlformats.org/officeDocument/2006/bibliography"/>
+    <ds:schemaRef ds:uri="http://schemas.microsoft.com/sharepoint/v3/contenttype/forms"/>
   </ds:schemaRefs>
 </ds:datastoreItem>
 </file>
@@ -3890,8 +4877,15 @@
 <file path=customXml/itemProps4.xml><?xml version="1.0" encoding="utf-8"?>
 <ds:datastoreItem xmlns:ds="http://schemas.openxmlformats.org/officeDocument/2006/customXml" ds:itemID="{2FAD7FCA-C481-43FC-8A05-03617FBAE5AF}">
   <ds:schemaRefs>
+    <ds:schemaRef ds:uri="http://schemas.openxmlformats.org/package/2006/metadata/core-properties"/>
+    <ds:schemaRef ds:uri="http://purl.org/dc/elements/1.1/"/>
+    <ds:schemaRef ds:uri="http://www.w3.org/XML/1998/namespace"/>
+    <ds:schemaRef ds:uri="http://schemas.microsoft.com/office/2006/documentManagement/types"/>
+    <ds:schemaRef ds:uri="http://purl.org/dc/dcmitype/"/>
     <ds:schemaRef ds:uri="http://schemas.microsoft.com/office/2006/metadata/properties"/>
     <ds:schemaRef ds:uri="http://schemas.microsoft.com/office/infopath/2007/PartnerControls"/>
+    <ds:schemaRef ds:uri="710a41d7-b15a-4f7c-a375-e266e999769c"/>
+    <ds:schemaRef ds:uri="http://purl.org/dc/terms/"/>
   </ds:schemaRefs>
 </ds:datastoreItem>
 </file>
</xml_diff>